<commit_message>
Update team contribution section
</commit_message>
<xml_diff>
--- a/KM3_Raport_Finalny.docx
+++ b/KM3_Raport_Finalny.docx
@@ -2169,7 +2169,7 @@
     </w:p>
     <w:p>
       <w:r>
-        <w:t>Sekcja do doprecyzowania przez zespół przed oddaniem. Proponowany układ:</w:t>
+        <w:t>Prace w projekcie zostały podzielone zgodnie z głównymi obszarami systemu: analizą źródeł, projektowaniem modelu danych, implementacją ETL/ELT, walidacją jakości danych oraz przygotowaniem warstwy raportowej. Poszczególne elementy były konsultowane w zespole, tak aby model hurtowni, proces przetwarzania i raporty Power BI były spójne z założeniami projektu.</w:t>
       </w:r>
     </w:p>
     <w:tbl>
@@ -2221,7 +2221,7 @@
           </w:tcPr>
           <w:p>
             <w:r>
-              <w:t>Źródła danych, przygotowanie danych CSV, część raportowa / dokumentacja - do doprecyzowania.</w:t>
+              <w:t>Analiza źródeł danych dotyczących zdrowia psychicznego i ekonomii, przygotowanie oraz weryfikacja plików CSV, udział w mapowaniu zaburzeń psychicznych do kategorii używanych w hurtowni, wsparcie opisu źródeł danych i interpretacji raportów biznesowych.</w:t>
             </w:r>
           </w:p>
         </w:tc>
@@ -2243,7 +2243,7 @@
           </w:tcPr>
           <w:p>
             <w:r>
-              <w:t>Model danych, STTM, walidacja danych / Power BI - do doprecyzowania.</w:t>
+              <w:t>Projektowanie modelu hurtowni danych, przygotowanie dokumentu STTM i założeń transformacji, walidacja zgodności tabel wymiarów i faktów z wymaganiami KM2/KM3, udział w analizie jakości danych oraz w przygotowaniu warstwy raportowej Power BI.</w:t>
             </w:r>
           </w:p>
         </w:tc>
@@ -2265,12 +2265,17 @@
           </w:tcPr>
           <w:p>
             <w:r>
-              <w:t>SQL Server, ETL/ELT, testy funkcjonalne, integracja Power BI - do doprecyzowania.</w:t>
+              <w:t>Implementacja modelu SQL Server, przygotowanie modułu ETL/ELT w Pythonie i SQL, integracja danych ze stagingu do hurtowni, przygotowanie testów funkcjonalnych i zapytań weryfikacyjnych, konfiguracja modelu Power BI oraz uporządkowanie repozytorium projektu.</w:t>
             </w:r>
           </w:p>
         </w:tc>
       </w:tr>
     </w:tbl>
+    <w:p>
+      <w:r>
+        <w:t>Elementy końcowe, takie jak dobór wizualizacji, wnioski biznesowe, testy end-to-end oraz przygotowanie materiałów do oddania, były realizowane wspólnie na podstawie wyników działania systemu i raportów Power BI.</w:t>
+      </w:r>
+    </w:p>
     <w:p>
       <w:pPr>
         <w:pStyle w:val="Heading1"/>

</xml_diff>